<commit_message>
fix: smart_gen_data first_name/last_name/phone/city + back button + backend comments + reviewer docs
- smart_gen_data.py: fix ftype=name handler generating full names for first_name/last_name fields
- smart_gen_data.py: default phone generation to PH mobile format (09xx) instead of US +1
- smart_gen_data.py: fix city field tagged as address type generating street addresses
- DataPreview.jsx: fix Back button routing to /schema-builder instead of /downloads
- All 14 Python backend files: add informal dev-to-dev comments throughout
- docs/generate_backend_doc.py: add Section 11 demo dataset prompts (loan applicant)
- docs/SynthCS_Backend_Reviewer.docx: regenerated with new Section 11

Co-Authored-By: Claude Sonnet 4.6 <noreply@anthropic.com>
</commit_message>
<xml_diff>
--- a/docs/SynthCS_Backend_Reviewer.docx
+++ b/docs/SynthCS_Backend_Reviewer.docx
@@ -4523,6 +4523,666 @@
         <w:t>────────────────────────────────────────────────────────────────────────────────</w:t>
       </w:r>
     </w:p>
+    <w:p>
+      <w:r>
+        <w:br w:type="page"/>
+      </w:r>
+    </w:p>
+    <w:p>
+      <w:pPr>
+        <w:pStyle w:val="Heading1"/>
+        <w:jc w:val="left"/>
+      </w:pPr>
+      <w:r>
+        <w:rPr>
+          <w:color w:val="6D28D9"/>
+        </w:rPr>
+        <w:t>11. Demo Dataset Prompts — For System Defense Demonstration</w:t>
+      </w:r>
+    </w:p>
+    <w:p>
+      <w:r>
+        <w:rPr>
+          <w:color w:val="D1D5DB"/>
+          <w:sz w:val="16"/>
+        </w:rPr>
+        <w:t>────────────────────────────────────────────────────────────────────────────────</w:t>
+      </w:r>
+    </w:p>
+    <w:p>
+      <w:r>
+        <w:rPr>
+          <w:b/>
+          <w:color w:val="1D4ED8"/>
+        </w:rPr>
+        <w:t xml:space="preserve">🇺🇸 EN: </w:t>
+      </w:r>
+      <w:r>
+        <w:t>This section provides ready-to-use prompts that demonstrate SynthCS capabilities during the panel defense. These prompts were chosen because they showcase key features: schema awareness, approval logic, numeric correlations, and categorical value control. Use these exact prompts when demonstrating the system live.</w:t>
+      </w:r>
+    </w:p>
+    <w:p>
+      <w:pPr>
+        <w:ind w:left="0"/>
+      </w:pPr>
+      <w:r>
+        <w:rPr>
+          <w:b/>
+          <w:color w:val="15803D"/>
+        </w:rPr>
+        <w:t xml:space="preserve">🇵🇭 TL: </w:t>
+      </w:r>
+      <w:r>
+        <w:t>Ang seksyon na ito ay nagbibigay ng mga handa nang gamitin na prompts na nagpapakita ng mga kakayahan ng SynthCS sa panahon ng panel defense. Ang mga prompt na ito ay pinili dahil ipinapakita nila ang mga pangunahing features: schema awareness, approval logic, numeric correlations, at categorical value control. Gamitin ang mga eksaktong prompt na ito kapag nagde-demonstrate ng sistema nang live.</w:t>
+      </w:r>
+    </w:p>
+    <w:p/>
+    <w:p>
+      <w:pPr>
+        <w:pStyle w:val="Heading2"/>
+        <w:jc w:val="left"/>
+      </w:pPr>
+      <w:r>
+        <w:t>11.1 Demo Prompt — Loan Applicant Dataset</w:t>
+      </w:r>
+    </w:p>
+    <w:p>
+      <w:r>
+        <w:rPr>
+          <w:b/>
+          <w:color w:val="1D4ED8"/>
+        </w:rPr>
+        <w:t xml:space="preserve">🇺🇸 EN: </w:t>
+      </w:r>
+      <w:r>
+        <w:t>USE CASE: Demonstrates SynthCS generating financial risk data with realistic approval logic. Suitable for fraud detection, credit scoring, or machine learning classification demos.</w:t>
+      </w:r>
+    </w:p>
+    <w:p>
+      <w:pPr>
+        <w:ind w:left="0"/>
+      </w:pPr>
+      <w:r>
+        <w:rPr>
+          <w:b/>
+          <w:color w:val="15803D"/>
+        </w:rPr>
+        <w:t xml:space="preserve">🇵🇭 TL: </w:t>
+      </w:r>
+      <w:r>
+        <w:t>GAMIT: Ipinapakita ang SynthCS na gumagawa ng financial risk data na may realistic na approval logic. Angkop para sa fraud detection, credit scoring, o machine learning classification demos.</w:t>
+      </w:r>
+    </w:p>
+    <w:p/>
+    <w:p>
+      <w:pPr>
+        <w:pStyle w:val="Heading3"/>
+        <w:jc w:val="left"/>
+      </w:pPr>
+      <w:r>
+        <w:t>Prompt to type into SynthCS:</w:t>
+      </w:r>
+    </w:p>
+    <w:p>
+      <w:pPr>
+        <w:ind w:left="432"/>
+      </w:pPr>
+      <w:r>
+        <w:rPr>
+          <w:rFonts w:ascii="Courier New" w:hAnsi="Courier New"/>
+          <w:color w:val="6D28D9"/>
+          <w:sz w:val="18"/>
+        </w:rPr>
+        <w:t>Loan applicant dataset with fields: id, loan_amount, term_months, credit_score, annual_income, employment_years, debt_to_income, home_ownership, purpose, approved</w:t>
+      </w:r>
+    </w:p>
+    <w:p>
+      <w:pPr>
+        <w:pStyle w:val="Heading3"/>
+        <w:jc w:val="left"/>
+      </w:pPr>
+      <w:r>
+        <w:t>What to say to the panel while typing this prompt:</w:t>
+      </w:r>
+    </w:p>
+    <w:p>
+      <w:r>
+        <w:rPr>
+          <w:b/>
+          <w:color w:val="1D4ED8"/>
+        </w:rPr>
+        <w:t xml:space="preserve">🇺🇸 EN: </w:t>
+      </w:r>
+      <w:r>
+        <w:t>EN: "I will now type a plain-English description of the dataset I need. Notice that I am not writing code or SQL — just a natural description. SynthCS will send this to Claude, which will extract the field names, infer appropriate types and constraints for each field, and return a structured schema."</w:t>
+      </w:r>
+    </w:p>
+    <w:p>
+      <w:pPr>
+        <w:ind w:left="0"/>
+      </w:pPr>
+      <w:r>
+        <w:rPr>
+          <w:b/>
+          <w:color w:val="15803D"/>
+        </w:rPr>
+        <w:t xml:space="preserve">🇵🇭 TL: </w:t>
+      </w:r>
+      <w:r>
+        <w:t>TL: "Magta-type na ako ng plain-English na paglalarawan ng dataset na kailangan ko. Pansinin na hindi ako sumusulat ng code o SQL — natural na paglalarawan lamang. Ipapadala ito ng SynthCS kay Claude, na kukuha ng mga field names, mag-iinfer ng angkop na types at constraints para sa bawat field, at magbabalik ng structured schema."</w:t>
+      </w:r>
+    </w:p>
+    <w:p/>
+    <w:p>
+      <w:pPr>
+        <w:pStyle w:val="Heading3"/>
+        <w:jc w:val="left"/>
+      </w:pPr>
+      <w:r>
+        <w:t>Expected schema fields and their types:</w:t>
+      </w:r>
+    </w:p>
+    <w:p>
+      <w:pPr>
+        <w:spacing w:after="80"/>
+        <w:ind w:left="432"/>
+      </w:pPr>
+      <w:r>
+        <w:rPr>
+          <w:rFonts w:ascii="Courier New" w:hAnsi="Courier New"/>
+          <w:b/>
+          <w:color w:val="6D28D9"/>
+        </w:rPr>
+        <w:t xml:space="preserve">id  </w:t>
+      </w:r>
+      <w:r>
+        <w:rPr>
+          <w:rFonts w:ascii="Courier New" w:hAnsi="Courier New"/>
+          <w:color w:val="0F766E"/>
+        </w:rPr>
+        <w:t>[integer]</w:t>
+      </w:r>
+      <w:r>
+        <w:br/>
+        <w:t xml:space="preserve">    EN: Unique applicant identifier. Auto-increments from 1.</w:t>
+        <w:br/>
+        <w:t xml:space="preserve">    TL: Natatanging identifier ng aplikante. Awtomatikong dumarami mula sa 1.</w:t>
+      </w:r>
+    </w:p>
+    <w:p>
+      <w:pPr>
+        <w:spacing w:after="80"/>
+        <w:ind w:left="432"/>
+      </w:pPr>
+      <w:r>
+        <w:rPr>
+          <w:rFonts w:ascii="Courier New" w:hAnsi="Courier New"/>
+          <w:b/>
+          <w:color w:val="6D28D9"/>
+        </w:rPr>
+        <w:t xml:space="preserve">loan_amount  </w:t>
+      </w:r>
+      <w:r>
+        <w:rPr>
+          <w:rFonts w:ascii="Courier New" w:hAnsi="Courier New"/>
+          <w:color w:val="0F766E"/>
+        </w:rPr>
+        <w:t>[float]</w:t>
+      </w:r>
+      <w:r>
+        <w:br/>
+        <w:t xml:space="preserve">    EN: Requested loan amount in Philippine pesos. Range: ₱50,000–₱5,000,000.</w:t>
+        <w:br/>
+        <w:t xml:space="preserve">    TL: Halagang hinihingi bilang pautang sa Philippine pesos. Range: ₱50,000–₱5,000,000.</w:t>
+      </w:r>
+    </w:p>
+    <w:p>
+      <w:pPr>
+        <w:spacing w:after="80"/>
+        <w:ind w:left="432"/>
+      </w:pPr>
+      <w:r>
+        <w:rPr>
+          <w:rFonts w:ascii="Courier New" w:hAnsi="Courier New"/>
+          <w:b/>
+          <w:color w:val="6D28D9"/>
+        </w:rPr>
+        <w:t xml:space="preserve">term_months  </w:t>
+      </w:r>
+      <w:r>
+        <w:rPr>
+          <w:rFonts w:ascii="Courier New" w:hAnsi="Courier New"/>
+          <w:color w:val="0F766E"/>
+        </w:rPr>
+        <w:t>[integer]</w:t>
+      </w:r>
+      <w:r>
+        <w:br/>
+        <w:t xml:space="preserve">    EN: Loan repayment period in months. Enum: 12, 24, 36, 48, 60.</w:t>
+        <w:br/>
+        <w:t xml:space="preserve">    TL: Panahon ng pagbabayad ng pautang sa buwan. Enum: 12, 24, 36, 48, 60.</w:t>
+      </w:r>
+    </w:p>
+    <w:p>
+      <w:pPr>
+        <w:spacing w:after="80"/>
+        <w:ind w:left="432"/>
+      </w:pPr>
+      <w:r>
+        <w:rPr>
+          <w:rFonts w:ascii="Courier New" w:hAnsi="Courier New"/>
+          <w:b/>
+          <w:color w:val="6D28D9"/>
+        </w:rPr>
+        <w:t xml:space="preserve">credit_score  </w:t>
+      </w:r>
+      <w:r>
+        <w:rPr>
+          <w:rFonts w:ascii="Courier New" w:hAnsi="Courier New"/>
+          <w:color w:val="0F766E"/>
+        </w:rPr>
+        <w:t>[integer]</w:t>
+      </w:r>
+      <w:r>
+        <w:br/>
+        <w:t xml:space="preserve">    EN: Applicant's credit score. Range: 300–850. Higher = better creditworthiness.</w:t>
+        <w:br/>
+        <w:t xml:space="preserve">    TL: Credit score ng aplikante. Range: 300–850. Mas mataas = mas mahusay na creditworthiness.</w:t>
+      </w:r>
+    </w:p>
+    <w:p>
+      <w:pPr>
+        <w:spacing w:after="80"/>
+        <w:ind w:left="432"/>
+      </w:pPr>
+      <w:r>
+        <w:rPr>
+          <w:rFonts w:ascii="Courier New" w:hAnsi="Courier New"/>
+          <w:b/>
+          <w:color w:val="6D28D9"/>
+        </w:rPr>
+        <w:t xml:space="preserve">annual_income  </w:t>
+      </w:r>
+      <w:r>
+        <w:rPr>
+          <w:rFonts w:ascii="Courier New" w:hAnsi="Courier New"/>
+          <w:color w:val="0F766E"/>
+        </w:rPr>
+        <w:t>[float]</w:t>
+      </w:r>
+      <w:r>
+        <w:br/>
+        <w:t xml:space="preserve">    EN: Annual income in Philippine pesos. Range: ₱180,000–₱5,000,000.</w:t>
+        <w:br/>
+        <w:t xml:space="preserve">    TL: Taunang kita sa Philippine pesos. Range: ₱180,000–₱5,000,000.</w:t>
+      </w:r>
+    </w:p>
+    <w:p>
+      <w:pPr>
+        <w:spacing w:after="80"/>
+        <w:ind w:left="432"/>
+      </w:pPr>
+      <w:r>
+        <w:rPr>
+          <w:rFonts w:ascii="Courier New" w:hAnsi="Courier New"/>
+          <w:b/>
+          <w:color w:val="6D28D9"/>
+        </w:rPr>
+        <w:t xml:space="preserve">employment_years  </w:t>
+      </w:r>
+      <w:r>
+        <w:rPr>
+          <w:rFonts w:ascii="Courier New" w:hAnsi="Courier New"/>
+          <w:color w:val="0F766E"/>
+        </w:rPr>
+        <w:t>[float]</w:t>
+      </w:r>
+      <w:r>
+        <w:br/>
+        <w:t xml:space="preserve">    EN: Years at current employer. Range: 0–30.</w:t>
+        <w:br/>
+        <w:t xml:space="preserve">    TL: Taon sa kasalukuyang employer. Range: 0–30.</w:t>
+      </w:r>
+    </w:p>
+    <w:p>
+      <w:pPr>
+        <w:spacing w:after="80"/>
+        <w:ind w:left="432"/>
+      </w:pPr>
+      <w:r>
+        <w:rPr>
+          <w:rFonts w:ascii="Courier New" w:hAnsi="Courier New"/>
+          <w:b/>
+          <w:color w:val="6D28D9"/>
+        </w:rPr>
+        <w:t xml:space="preserve">debt_to_income  </w:t>
+      </w:r>
+      <w:r>
+        <w:rPr>
+          <w:rFonts w:ascii="Courier New" w:hAnsi="Courier New"/>
+          <w:color w:val="0F766E"/>
+        </w:rPr>
+        <w:t>[float]</w:t>
+      </w:r>
+      <w:r>
+        <w:br/>
+        <w:t xml:space="preserve">    EN: Total monthly debt divided by monthly income. Range: 0.05–0.80.</w:t>
+        <w:br/>
+        <w:t xml:space="preserve">    TL: Kabuuang buwanang utang na hinati sa buwanang kita. Range: 0.05–0.80.</w:t>
+      </w:r>
+    </w:p>
+    <w:p>
+      <w:pPr>
+        <w:spacing w:after="80"/>
+        <w:ind w:left="432"/>
+      </w:pPr>
+      <w:r>
+        <w:rPr>
+          <w:rFonts w:ascii="Courier New" w:hAnsi="Courier New"/>
+          <w:b/>
+          <w:color w:val="6D28D9"/>
+        </w:rPr>
+        <w:t xml:space="preserve">home_ownership  </w:t>
+      </w:r>
+      <w:r>
+        <w:rPr>
+          <w:rFonts w:ascii="Courier New" w:hAnsi="Courier New"/>
+          <w:color w:val="0F766E"/>
+        </w:rPr>
+        <w:t>[string (enum)]</w:t>
+      </w:r>
+      <w:r>
+        <w:br/>
+        <w:t xml:space="preserve">    EN: Housing status. Values: OWN, RENT, MORTGAGE.</w:t>
+        <w:br/>
+        <w:t xml:space="preserve">    TL: Katayuan sa pabahay. Values: OWN, RENT, MORTGAGE.</w:t>
+      </w:r>
+    </w:p>
+    <w:p>
+      <w:pPr>
+        <w:spacing w:after="80"/>
+        <w:ind w:left="432"/>
+      </w:pPr>
+      <w:r>
+        <w:rPr>
+          <w:rFonts w:ascii="Courier New" w:hAnsi="Courier New"/>
+          <w:b/>
+          <w:color w:val="6D28D9"/>
+        </w:rPr>
+        <w:t xml:space="preserve">purpose  </w:t>
+      </w:r>
+      <w:r>
+        <w:rPr>
+          <w:rFonts w:ascii="Courier New" w:hAnsi="Courier New"/>
+          <w:color w:val="0F766E"/>
+        </w:rPr>
+        <w:t>[string (enum)]</w:t>
+      </w:r>
+      <w:r>
+        <w:br/>
+        <w:t xml:space="preserve">    EN: Reason for the loan. Values: home_improvement, debt_consolidation, education, medical, business, car, vacation.</w:t>
+        <w:br/>
+        <w:t xml:space="preserve">    TL: Dahilan ng pautang. Values: home_improvement, debt_consolidation, education, medical, business, car, vacation.</w:t>
+      </w:r>
+    </w:p>
+    <w:p>
+      <w:pPr>
+        <w:spacing w:after="80"/>
+        <w:ind w:left="432"/>
+      </w:pPr>
+      <w:r>
+        <w:rPr>
+          <w:rFonts w:ascii="Courier New" w:hAnsi="Courier New"/>
+          <w:b/>
+          <w:color w:val="6D28D9"/>
+        </w:rPr>
+        <w:t xml:space="preserve">approved  </w:t>
+      </w:r>
+      <w:r>
+        <w:rPr>
+          <w:rFonts w:ascii="Courier New" w:hAnsi="Courier New"/>
+          <w:color w:val="0F766E"/>
+        </w:rPr>
+        <w:t>[boolean]</w:t>
+      </w:r>
+      <w:r>
+        <w:br/>
+        <w:t xml:space="preserve">    EN: Loan approval decision. true = approved, false = declined.</w:t>
+        <w:br/>
+        <w:t xml:space="preserve">    TL: Desisyon sa pag-apruba ng pautang. true = approved, false = declined.</w:t>
+      </w:r>
+    </w:p>
+    <w:p>
+      <w:pPr>
+        <w:pStyle w:val="Heading3"/>
+        <w:jc w:val="left"/>
+      </w:pPr>
+      <w:r>
+        <w:t>Generation settings to use during the demo:</w:t>
+      </w:r>
+    </w:p>
+    <w:p>
+      <w:pPr>
+        <w:spacing w:after="80"/>
+        <w:ind w:left="432"/>
+      </w:pPr>
+      <w:r>
+        <w:rPr>
+          <w:b/>
+        </w:rPr>
+        <w:t xml:space="preserve">• Row count: </w:t>
+      </w:r>
+      <w:r>
+        <w:rPr>
+          <w:b/>
+          <w:color w:val="6D28D9"/>
+        </w:rPr>
+        <w:t>50 rows</w:t>
+      </w:r>
+      <w:r>
+        <w:br/>
+        <w:t xml:space="preserve">    EN: Small enough to load instantly, large enough to show variety.</w:t>
+        <w:br/>
+        <w:t xml:space="preserve">    TL: Sapat na maliit para mag-load agad, sapat na malaki para ipakita ang pagkakaiba-iba.</w:t>
+      </w:r>
+    </w:p>
+    <w:p>
+      <w:pPr>
+        <w:spacing w:after="80"/>
+        <w:ind w:left="432"/>
+      </w:pPr>
+      <w:r>
+        <w:rPr>
+          <w:b/>
+        </w:rPr>
+        <w:t xml:space="preserve">• Generation path: </w:t>
+      </w:r>
+      <w:r>
+        <w:rPr>
+          <w:b/>
+          <w:color w:val="6D28D9"/>
+        </w:rPr>
+        <w:t>LLM Path (no real dataset)</w:t>
+      </w:r>
+      <w:r>
+        <w:br/>
+        <w:t xml:space="preserve">    EN: Shows the pure AI schema generation capability.</w:t>
+        <w:br/>
+        <w:t xml:space="preserve">    TL: Ipinapakita ang purong AI schema generation capability.</w:t>
+      </w:r>
+    </w:p>
+    <w:p>
+      <w:pPr>
+        <w:spacing w:after="80"/>
+        <w:ind w:left="432"/>
+      </w:pPr>
+      <w:r>
+        <w:rPr>
+          <w:b/>
+        </w:rPr>
+        <w:t xml:space="preserve">• Approval logic to mention: </w:t>
+      </w:r>
+      <w:r>
+        <w:rPr>
+          <w:b/>
+          <w:color w:val="6D28D9"/>
+        </w:rPr>
+        <w:t>~60% approved, ~40% declined</w:t>
+      </w:r>
+      <w:r>
+        <w:br/>
+        <w:t xml:space="preserve">    EN: The Gaussian Copula will learn the true/false ratio from the 200-row template and preserve it at scale.</w:t>
+        <w:br/>
+        <w:t xml:space="preserve">    TL: Matututo ang Gaussian Copula sa true/false ratio mula sa 200-row template at pananatilihin ito sa malaking bilang.</w:t>
+      </w:r>
+    </w:p>
+    <w:p>
+      <w:pPr>
+        <w:pStyle w:val="Heading3"/>
+        <w:jc w:val="left"/>
+      </w:pPr>
+      <w:r>
+        <w:t>Key talking point for the panel:</w:t>
+      </w:r>
+    </w:p>
+    <w:p>
+      <w:r>
+        <w:rPr>
+          <w:b/>
+          <w:color w:val="1D4ED8"/>
+        </w:rPr>
+        <w:t xml:space="preserve">🇺🇸 EN: </w:t>
+      </w:r>
+      <w:r>
+        <w:t>EN: "The approved column demonstrates how SynthCS can encode business logic into schema constraints. By setting the true_ratio in the schema, I can control the approval rate in the generated dataset. The Gaussian Copula then learns the correlation between credit_score, debt_to_income, and approved — so in the scaled-up output, high-credit-score applicants are statistically more likely to be approved, just as they would be in a real bank's dataset."</w:t>
+      </w:r>
+    </w:p>
+    <w:p>
+      <w:pPr>
+        <w:ind w:left="0"/>
+      </w:pPr>
+      <w:r>
+        <w:rPr>
+          <w:b/>
+          <w:color w:val="15803D"/>
+        </w:rPr>
+        <w:t xml:space="preserve">🇵🇭 TL: </w:t>
+      </w:r>
+      <w:r>
+        <w:t>TL: "Ang approved column ay nagpapakita kung paano makakapaglagay ang SynthCS ng business logic sa schema constraints. Sa pamamagitan ng pagtatakda ng true_ratio sa schema, makokontrol ko ang approval rate sa nagawang dataset. Pagkatapos ay matututo ang Gaussian Copula sa correlation sa pagitan ng credit_score, debt_to_income, at approved — kaya sa scaled-up na output, ang mga aplikanteng may mataas na credit score ay statistically mas malamang na maaprubahan, tulad ng sa tunay na dataset ng isang bangko."</w:t>
+      </w:r>
+    </w:p>
+    <w:p/>
+    <w:p>
+      <w:r>
+        <w:rPr>
+          <w:color w:val="D1D5DB"/>
+          <w:sz w:val="16"/>
+        </w:rPr>
+        <w:t>────────────────────────────────────────────────────────────────────────────────</w:t>
+      </w:r>
+    </w:p>
+    <w:p>
+      <w:pPr>
+        <w:pStyle w:val="Heading2"/>
+        <w:jc w:val="left"/>
+      </w:pPr>
+      <w:r>
+        <w:t>11.2 How the Generated Dataset Can Be Used (Downstream Application)</w:t>
+      </w:r>
+    </w:p>
+    <w:p>
+      <w:r>
+        <w:rPr>
+          <w:b/>
+          <w:color w:val="1D4ED8"/>
+        </w:rPr>
+        <w:t xml:space="preserve">🇺🇸 EN: </w:t>
+      </w:r>
+      <w:r>
+        <w:t>The 50-row (or scaled-up) loan applicant dataset generated by SynthCS can be directly used in downstream applications such as a fraud detection or credit scoring prototype. The following fields are particularly useful for ML classification:</w:t>
+      </w:r>
+    </w:p>
+    <w:p>
+      <w:pPr>
+        <w:ind w:left="0"/>
+      </w:pPr>
+      <w:r>
+        <w:rPr>
+          <w:b/>
+          <w:color w:val="15803D"/>
+        </w:rPr>
+        <w:t xml:space="preserve">🇵🇭 TL: </w:t>
+      </w:r>
+      <w:r>
+        <w:t>Ang 50-row (o scaled-up) loan applicant dataset na ginawa ng SynthCS ay maaaring direktang gamitin sa mga downstream applications tulad ng isang fraud detection o credit scoring prototype. Ang mga sumusunod na fields ay partikular na kapaki-pakinabang para sa ML classification:</w:t>
+      </w:r>
+    </w:p>
+    <w:p/>
+    <w:p>
+      <w:pPr>
+        <w:spacing w:after="80"/>
+        <w:ind w:left="432"/>
+      </w:pPr>
+      <w:r>
+        <w:rPr>
+          <w:b/>
+          <w:color w:val="6D28D9"/>
+        </w:rPr>
+        <w:t xml:space="preserve">• Features (X): </w:t>
+      </w:r>
+      <w:r>
+        <w:t>credit_score, annual_income, employment_years, debt_to_income, loan_amount, home_ownership, purpose</w:t>
+        <w:br/>
+        <w:t xml:space="preserve">    TL: Mga input na ginagamit ng modelo para hulaan</w:t>
+      </w:r>
+    </w:p>
+    <w:p>
+      <w:pPr>
+        <w:spacing w:after="80"/>
+        <w:ind w:left="432"/>
+      </w:pPr>
+      <w:r>
+        <w:rPr>
+          <w:b/>
+          <w:color w:val="6D28D9"/>
+        </w:rPr>
+        <w:t xml:space="preserve">• Target (y): </w:t>
+      </w:r>
+      <w:r>
+        <w:t>approved</w:t>
+        <w:br/>
+        <w:t xml:space="preserve">    TL: Ang label na sinusubukan ng modelo na hulaan (binary: true/false)</w:t>
+      </w:r>
+    </w:p>
+    <w:p>
+      <w:r>
+        <w:rPr>
+          <w:b/>
+          <w:color w:val="1D4ED8"/>
+        </w:rPr>
+        <w:t xml:space="preserve">🇺🇸 EN: </w:t>
+      </w:r>
+      <w:r>
+        <w:t>EN: This demonstrates the VALUE CHAIN of SynthCS: (1) No real loan data is needed — SynthCS generates realistic synthetic records. (2) The generated dataset can be downloaded as CSV and immediately imported into a Jupyter notebook, scikit-learn pipeline, or Tableau dashboard. (3) Privacy is preserved — no real applicant PII is ever used or exposed.</w:t>
+      </w:r>
+    </w:p>
+    <w:p>
+      <w:pPr>
+        <w:ind w:left="0"/>
+      </w:pPr>
+      <w:r>
+        <w:rPr>
+          <w:b/>
+          <w:color w:val="15803D"/>
+        </w:rPr>
+        <w:t xml:space="preserve">🇵🇭 TL: </w:t>
+      </w:r>
+      <w:r>
+        <w:t>TL: Ipinapakita nito ang VALUE CHAIN ng SynthCS: (1) Hindi kailangan ng tunay na loan data — gumagawa ang SynthCS ng realistic synthetic records. (2) Ang nagawang dataset ay maaaring i-download bilang CSV at agad na i-import sa Jupyter notebook, scikit-learn pipeline, o Tableau dashboard. (3) Napanatili ang privacy — walang tunay na PII ng aplikante ang ginamit o na-expose.</w:t>
+      </w:r>
+    </w:p>
+    <w:p/>
     <w:sectPr>
       <w:pgSz w:w="12240" w:h="15840"/>
       <w:pgMar w:top="1134" w:right="1417" w:bottom="1134" w:left="1417" w:header="720" w:footer="720" w:gutter="0"/>

</xml_diff>

<commit_message>
ui: spacing/overlap audit + reviewer section 12
- UserAccounts: full Tailwind rewrite (was raw inline CSS, now matches app design system)
- Dashboard: Quick Generate slider min 10k→1k to match 1k default row count
- DataPreview: fix exportFormat indent; add mobile separator between tabs and export row
- Layout: page-specific header subtitles for each route
- Reviewer: add Section 12 — CSV-only import design decision + export format table + panel talking point

Co-Authored-By: Claude Sonnet 4.6 <noreply@anthropic.com>
</commit_message>
<xml_diff>
--- a/docs/SynthCS_Backend_Reviewer.docx
+++ b/docs/SynthCS_Backend_Reviewer.docx
@@ -5180,6 +5180,225 @@
       </w:r>
       <w:r>
         <w:t>TL: Ipinapakita nito ang VALUE CHAIN ng SynthCS: (1) Hindi kailangan ng tunay na loan data — gumagawa ang SynthCS ng realistic synthetic records. (2) Ang nagawang dataset ay maaaring i-download bilang CSV at agad na i-import sa Jupyter notebook, scikit-learn pipeline, o Tableau dashboard. (3) Napanatili ang privacy — walang tunay na PII ng aplikante ang ginamit o na-expose.</w:t>
+      </w:r>
+    </w:p>
+    <w:p/>
+    <w:p>
+      <w:r>
+        <w:rPr>
+          <w:color w:val="D1D5DB"/>
+          <w:sz w:val="16"/>
+        </w:rPr>
+        <w:t>────────────────────────────────────────────────────────────────────────────────</w:t>
+      </w:r>
+    </w:p>
+    <w:p>
+      <w:pPr>
+        <w:pStyle w:val="Heading1"/>
+        <w:jc w:val="left"/>
+      </w:pPr>
+      <w:r>
+        <w:t>12. Import &amp; Export Format Design Decision</w:t>
+      </w:r>
+    </w:p>
+    <w:p>
+      <w:pPr>
+        <w:pStyle w:val="Heading2"/>
+        <w:jc w:val="left"/>
+      </w:pPr>
+      <w:r>
+        <w:t>12.1 Why SynthCS Only Accepts CSV for Import</w:t>
+      </w:r>
+    </w:p>
+    <w:p>
+      <w:r>
+        <w:rPr>
+          <w:b/>
+          <w:color w:val="1D4ED8"/>
+        </w:rPr>
+        <w:t xml:space="preserve">🇺🇸 EN: </w:t>
+      </w:r>
+      <w:r>
+        <w:t>EN: SynthCS supports only CSV file upload for dataset import. This is an intentional design decision, not a technical limitation. The synthesis models — CTGAN and Gaussian Copula — both require flat, tabular data: a simple rows-and-columns structure. Formats such as JSON or SQL can be hierarchical or multi-table, which would require additional preprocessing and schema-flattening logic before synthesis could begin. CSV is also the universal export format across spreadsheets (Excel, Google Sheets), databases (MySQL Workbench, pgAdmin), and data science tools (pandas, R). This means users can convert from virtually any source in one step. The decision prioritized getting the synthesis pipeline right over supporting multiple import formats.</w:t>
+      </w:r>
+    </w:p>
+    <w:p>
+      <w:pPr>
+        <w:ind w:left="0"/>
+      </w:pPr>
+      <w:r>
+        <w:rPr>
+          <w:b/>
+          <w:color w:val="15803D"/>
+        </w:rPr>
+        <w:t xml:space="preserve">🇵🇭 TL: </w:t>
+      </w:r>
+      <w:r>
+        <w:t>TL: Ang SynthCS ay tumatanggap lamang ng CSV file para sa pag-upload ng dataset. Ito ay isang sadyang desisyon sa disenyo, hindi isang teknikal na limitasyon. Ang mga synthesis models — CTGAN at Gaussian Copula — ay parehong nangangailangan ng flat, tabular data: isang simpleng rows-at-columns na istruktura. Ang mga format tulad ng JSON o SQL ay maaaring hierarchical o multi-table, na mangangailangan ng karagdagang preprocessing at schema-flattening bago magsimula ang synthesis. Ang CSV ay din ang universal na export format sa mga spreadsheets (Excel, Google Sheets), databases (MySQL Workbench, pgAdmin), at data science tools (pandas, R). Ibig sabihin, ang mga user ay madaling makakapag-convert mula sa halos anumang source sa iisang hakbang. Inuna ng desisyon ang wastong pagtatayo ng synthesis pipeline kaysa sa pagsuporta sa maraming import format.</w:t>
+      </w:r>
+    </w:p>
+    <w:p/>
+    <w:p>
+      <w:pPr>
+        <w:pStyle w:val="Heading2"/>
+        <w:jc w:val="left"/>
+      </w:pPr>
+      <w:r>
+        <w:t>12.2 Export Formats (5 Formats Supported)</w:t>
+      </w:r>
+    </w:p>
+    <w:p>
+      <w:r>
+        <w:rPr>
+          <w:b/>
+          <w:color w:val="1D4ED8"/>
+        </w:rPr>
+        <w:t xml:space="preserve">🇺🇸 EN: </w:t>
+      </w:r>
+      <w:r>
+        <w:t>EN: While import is restricted to CSV, SynthCS supports five export formats for the generated synthetic dataset. This asymmetry exists because export is simple serialization — the data is already a clean DataFrame, and it is just written out in a different format. Import is the harder direction because it involves trusting an unknown user file and normalizing it into a usable table.</w:t>
+      </w:r>
+    </w:p>
+    <w:p>
+      <w:pPr>
+        <w:ind w:left="0"/>
+      </w:pPr>
+      <w:r>
+        <w:rPr>
+          <w:b/>
+          <w:color w:val="15803D"/>
+        </w:rPr>
+        <w:t xml:space="preserve">🇵🇭 TL: </w:t>
+      </w:r>
+      <w:r>
+        <w:t>TL: Habang ang import ay limitado sa CSV, sinusuportahan ng SynthCS ang limang export format para sa nagawang synthetic dataset. Ang asymmetry na ito ay umiiral dahil ang export ay simpleng serialization — ang data ay isang malinis na DataFrame na, at isinusulat lamang ito sa ibang format. Ang import ang mas mahirap na direksyon dahil kailangan nitong pagkatiwalaan ang isang hindi kilalang file ng user at i-normalize ito sa isang magagamit na table.</w:t>
+      </w:r>
+    </w:p>
+    <w:p/>
+    <w:p>
+      <w:pPr>
+        <w:spacing w:after="80"/>
+        <w:ind w:left="432"/>
+      </w:pPr>
+      <w:r>
+        <w:rPr>
+          <w:b/>
+          <w:color w:val="6D28D9"/>
+        </w:rPr>
+        <w:t xml:space="preserve">• CSV: </w:t>
+      </w:r>
+      <w:r>
+        <w:t>Comma-separated values — universal tabular format</w:t>
+        <w:br/>
+        <w:t xml:space="preserve">    TL: Comma-separated values — universal na tabular format</w:t>
+      </w:r>
+    </w:p>
+    <w:p>
+      <w:pPr>
+        <w:spacing w:after="80"/>
+        <w:ind w:left="432"/>
+      </w:pPr>
+      <w:r>
+        <w:rPr>
+          <w:b/>
+          <w:color w:val="6D28D9"/>
+        </w:rPr>
+        <w:t xml:space="preserve">• JSON: </w:t>
+      </w:r>
+      <w:r>
+        <w:t>Array of objects — suitable for REST APIs and JavaScript apps</w:t>
+        <w:br/>
+        <w:t xml:space="preserve">    TL: Array ng mga objects — angkop para sa REST APIs at JavaScript apps</w:t>
+      </w:r>
+    </w:p>
+    <w:p>
+      <w:pPr>
+        <w:spacing w:after="80"/>
+        <w:ind w:left="432"/>
+      </w:pPr>
+      <w:r>
+        <w:rPr>
+          <w:b/>
+          <w:color w:val="6D28D9"/>
+        </w:rPr>
+        <w:t xml:space="preserve">• JSONL: </w:t>
+      </w:r>
+      <w:r>
+        <w:t>One JSON object per line — optimized for streaming and LLM training data</w:t>
+        <w:br/>
+        <w:t xml:space="preserve">    TL: Isang JSON object bawat linya — optimized para sa streaming at LLM training data</w:t>
+      </w:r>
+    </w:p>
+    <w:p>
+      <w:pPr>
+        <w:spacing w:after="80"/>
+        <w:ind w:left="432"/>
+      </w:pPr>
+      <w:r>
+        <w:rPr>
+          <w:b/>
+          <w:color w:val="6D28D9"/>
+        </w:rPr>
+        <w:t xml:space="preserve">• SQL: </w:t>
+      </w:r>
+      <w:r>
+        <w:t>INSERT statements — ready to load directly into a relational database</w:t>
+        <w:br/>
+        <w:t xml:space="preserve">    TL: Mga INSERT statement — handa nang i-load direkta sa isang relational database</w:t>
+      </w:r>
+    </w:p>
+    <w:p>
+      <w:pPr>
+        <w:spacing w:after="80"/>
+        <w:ind w:left="432"/>
+      </w:pPr>
+      <w:r>
+        <w:rPr>
+          <w:b/>
+          <w:color w:val="6D28D9"/>
+        </w:rPr>
+        <w:t xml:space="preserve">• Excel: </w:t>
+      </w:r>
+      <w:r>
+        <w:t>.xlsx workbook — for non-technical users and business stakeholders</w:t>
+        <w:br/>
+        <w:t xml:space="preserve">    TL: .xlsx workbook — para sa mga hindi teknikal na user at business stakeholders</w:t>
+      </w:r>
+    </w:p>
+    <w:p>
+      <w:pPr>
+        <w:pStyle w:val="Heading2"/>
+        <w:jc w:val="left"/>
+      </w:pPr>
+      <w:r>
+        <w:t>12.3 Panel Talking Point</w:t>
+      </w:r>
+    </w:p>
+    <w:p>
+      <w:r>
+        <w:rPr>
+          <w:b/>
+          <w:color w:val="1D4ED8"/>
+        </w:rPr>
+        <w:t xml:space="preserve">🇺🇸 EN: </w:t>
+      </w:r>
+      <w:r>
+        <w:t>EN: "We support CSV import because the synthesis models require flat, tabular data. Formats like JSON or SQL can be hierarchical or multi-table, which would need additional preprocessing before synthesis. CSV is also the universal export format for spreadsheets and databases, so users can easily convert from any source. We prioritized getting the synthesis pipeline right over supporting multiple import formats. Adding JSON or Excel import is straightforward — pandas already reads both natively — it is a planned enhancement, not a technical limitation."</w:t>
+      </w:r>
+    </w:p>
+    <w:p>
+      <w:pPr>
+        <w:ind w:left="0"/>
+      </w:pPr>
+      <w:r>
+        <w:rPr>
+          <w:b/>
+          <w:color w:val="15803D"/>
+        </w:rPr>
+        <w:t xml:space="preserve">🇵🇭 TL: </w:t>
+      </w:r>
+      <w:r>
+        <w:t>TL: "Sinusuportahan namin ang CSV import dahil ang mga synthesis models ay nangangailangan ng flat, tabular data. Ang mga format tulad ng JSON o SQL ay maaaring hierarchical o multi-table, na mangangailangan ng karagdagang preprocessing bago ang synthesis. Ang CSV ay din ang universal na export format para sa mga spreadsheets at databases, kaya madaling makakapag-convert ang mga user mula sa anumang source. Inuna namin ang wastong pagtatayo ng synthesis pipeline kaysa sa pagsuporta sa maraming import format. Ang pagdaragdag ng JSON o Excel import ay straightforward — ang pandas ay nagbabasa ng pareho natively — ito ay isang planong enhancement, hindi isang teknikal na limitasyon."</w:t>
       </w:r>
     </w:p>
     <w:p/>

</xml_diff>